<commit_message>
Team 6 Student Dashboard Mobile View v02 and cleaner docx
</commit_message>
<xml_diff>
--- a/03_Team_Work/Team6/Milestone_2_First_Dozen_Views/IC_Done/ST_M2_Team6_StudentDashboardDesignInformationTable_v01.docx
+++ b/03_Team_Work/Team6/Milestone_2_First_Dozen_Views/IC_Done/ST_M2_Team6_StudentDashboardDesignInformationTable_v01.docx
@@ -2,221 +2,6 @@
 <file path=word/document.xml><?xml version="1.0" encoding="utf-8"?>
 <w:document xmlns:wpc="http://schemas.microsoft.com/office/word/2010/wordprocessingCanvas" xmlns:cx="http://schemas.microsoft.com/office/drawing/2014/chartex" xmlns:cx1="http://schemas.microsoft.com/office/drawing/2015/9/8/chartex" xmlns:cx2="http://schemas.microsoft.com/office/drawing/2015/10/21/chartex" xmlns:cx3="http://schemas.microsoft.com/office/drawing/2016/5/9/chartex" xmlns:cx4="http://schemas.microsoft.com/office/drawing/2016/5/10/chartex" xmlns:cx5="http://schemas.microsoft.com/office/drawing/2016/5/11/chartex" xmlns:cx6="http://schemas.microsoft.com/office/drawing/2016/5/12/chartex" xmlns:cx7="http://schemas.microsoft.com/office/drawing/2016/5/13/chartex" xmlns:cx8="http://schemas.microsoft.com/office/drawing/2016/5/14/chartex" xmlns:mc="http://schemas.openxmlformats.org/markup-compatibility/2006" xmlns:aink="http://schemas.microsoft.com/office/drawing/2016/ink" xmlns:am3d="http://schemas.microsoft.com/office/drawing/2017/model3d" xmlns:o="urn:schemas-microsoft-com:office:office" xmlns:oel="http://schemas.microsoft.com/office/2019/extlst" xmlns:r="http://schemas.openxmlformats.org/officeDocument/2006/relationships" xmlns:m="http://schemas.openxmlformats.org/officeDocument/2006/math" xmlns:v="urn:schemas-microsoft-com:vml" xmlns:wp14="http://schemas.microsoft.com/office/word/2010/wordprocessingDrawing" xmlns:wp="http://schemas.openxmlformats.org/drawingml/2006/wordprocessingDrawing" xmlns:w10="urn:schemas-microsoft-com:office:word" xmlns:w="http://schemas.openxmlformats.org/wordprocessingml/2006/main" xmlns:w14="http://schemas.microsoft.com/office/word/2010/wordml" xmlns:w15="http://schemas.microsoft.com/office/word/2012/wordml" xmlns:w16cex="http://schemas.microsoft.com/office/word/2018/wordml/cex" xmlns:w16cid="http://schemas.microsoft.com/office/word/2016/wordml/cid" xmlns:w16="http://schemas.microsoft.com/office/word/2018/wordml" xmlns:w16du="http://schemas.microsoft.com/office/word/2023/wordml/word16du" xmlns:w16sdtdh="http://schemas.microsoft.com/office/word/2020/wordml/sdtdatahash" xmlns:w16sdtfl="http://schemas.microsoft.com/office/word/2024/wordml/sdtformatlock" xmlns:w16se="http://schemas.microsoft.com/office/word/2015/wordml/symex" xmlns:wpg="http://schemas.microsoft.com/office/word/2010/wordprocessingGroup" xmlns:wpi="http://schemas.microsoft.com/office/word/2010/wordprocessingInk" xmlns:wne="http://schemas.microsoft.com/office/word/2006/wordml" xmlns:wps="http://schemas.microsoft.com/office/word/2010/wordprocessingShape" mc:Ignorable="w14 w15 w16se w16cid w16 w16cex w16sdtdh w16sdtfl w16du wp14">
   <w:body>
-    <w:p>
-      <w:pPr>
-        <w:spacing w:line="240" w:lineRule="auto"/>
-        <w:outlineLvl w:val="0"/>
-        <w:rPr>
-          <w:rFonts w:ascii="Arial" w:eastAsia="Times New Roman" w:hAnsi="Arial" w:cs="Arial"/>
-          <w:i/>
-          <w:iCs/>
-          <w:kern w:val="36"/>
-          <w:sz w:val="28"/>
-          <w:szCs w:val="28"/>
-          <w:lang w:eastAsia="en-US"/>
-        </w:rPr>
-      </w:pPr>
-      <w:r>
-        <w:rPr>
-          <w:rFonts w:ascii="Arial" w:eastAsia="Times New Roman" w:hAnsi="Arial" w:cs="Arial"/>
-          <w:b/>
-          <w:bCs/>
-          <w:kern w:val="36"/>
-          <w:sz w:val="28"/>
-          <w:szCs w:val="28"/>
-          <w:lang w:eastAsia="en-US"/>
-        </w:rPr>
-        <w:t>2.1 Student Dashboard</w:t>
-      </w:r>
-    </w:p>
-    <w:p>
-      <w:pPr>
-        <w:spacing w:line="240" w:lineRule="auto"/>
-        <w:outlineLvl w:val="1"/>
-        <w:rPr>
-          <w:rFonts w:ascii="Arial" w:eastAsia="Times New Roman" w:hAnsi="Arial" w:cs="Arial"/>
-          <w:i/>
-          <w:iCs/>
-          <w:lang w:eastAsia="en-US"/>
-        </w:rPr>
-      </w:pPr>
-      <w:r>
-        <w:rPr>
-          <w:rFonts w:ascii="Arial" w:eastAsia="Times New Roman" w:hAnsi="Arial" w:cs="Arial"/>
-          <w:b/>
-          <w:bCs/>
-          <w:lang w:eastAsia="en-US"/>
-        </w:rPr>
-        <w:t>Desktop View</w:t>
-      </w:r>
-      <w:r>
-        <w:rPr>
-          <w:rFonts w:ascii="Arial" w:eastAsia="Times New Roman" w:hAnsi="Arial" w:cs="Arial"/>
-          <w:b/>
-          <w:bCs/>
-          <w:lang w:eastAsia="en-US"/>
-        </w:rPr>
-        <w:t xml:space="preserve"> </w:t>
-      </w:r>
-    </w:p>
-    <w:p>
-      <w:pPr>
-        <w:spacing w:line="240" w:lineRule="auto"/>
-        <w:rPr>
-          <w:rFonts w:ascii="Arial" w:eastAsia="Times New Roman" w:hAnsi="Arial" w:cs="Arial"/>
-          <w:i/>
-          <w:iCs/>
-          <w:sz w:val="20"/>
-          <w:szCs w:val="20"/>
-          <w:lang w:eastAsia="en-US"/>
-        </w:rPr>
-      </w:pPr>
-      <w:r>
-        <w:rPr>
-          <w:rFonts w:ascii="Arial" w:eastAsia="Times New Roman" w:hAnsi="Arial" w:cs="Arial"/>
-          <w:i/>
-          <w:iCs/>
-          <w:sz w:val="20"/>
-          <w:szCs w:val="20"/>
-          <w:lang w:eastAsia="en-US"/>
-        </w:rPr>
-        <w:t>(desktop wireframe image)</w:t>
-      </w:r>
-    </w:p>
-    <w:p>
-      <w:pPr>
-        <w:spacing w:line="240" w:lineRule="auto"/>
-        <w:rPr>
-          <w:rFonts w:ascii="Arial" w:eastAsia="Times New Roman" w:hAnsi="Arial" w:cs="Arial"/>
-          <w:sz w:val="20"/>
-          <w:szCs w:val="20"/>
-          <w:lang w:eastAsia="en-US"/>
-        </w:rPr>
-      </w:pPr>
-    </w:p>
-    <w:p>
-      <w:pPr>
-        <w:spacing w:line="240" w:lineRule="auto"/>
-        <w:outlineLvl w:val="1"/>
-        <w:rPr>
-          <w:rFonts w:ascii="Arial" w:eastAsia="Times New Roman" w:hAnsi="Arial" w:cs="Arial"/>
-          <w:b/>
-          <w:bCs/>
-          <w:lang w:eastAsia="en-US"/>
-        </w:rPr>
-      </w:pPr>
-      <w:r>
-        <w:rPr>
-          <w:rFonts w:ascii="Arial" w:eastAsia="Times New Roman" w:hAnsi="Arial" w:cs="Arial"/>
-          <w:b/>
-          <w:bCs/>
-          <w:lang w:eastAsia="en-US"/>
-        </w:rPr>
-        <w:t>Mobile View</w:t>
-      </w:r>
-      <w:r>
-        <w:rPr>
-          <w:rFonts w:ascii="Arial" w:eastAsia="Times New Roman" w:hAnsi="Arial" w:cs="Arial"/>
-          <w:b/>
-          <w:bCs/>
-          <w:lang w:eastAsia="en-US"/>
-        </w:rPr>
-        <w:t xml:space="preserve"> </w:t>
-      </w:r>
-    </w:p>
-    <w:p>
-      <w:pPr>
-        <w:spacing w:line="240" w:lineRule="auto"/>
-        <w:outlineLvl w:val="1"/>
-        <w:rPr>
-          <w:rFonts w:ascii="Arial" w:eastAsia="Times New Roman" w:hAnsi="Arial" w:cs="Arial"/>
-          <w:b/>
-          <w:bCs/>
-          <w:lang w:eastAsia="en-US"/>
-        </w:rPr>
-      </w:pPr>
-    </w:p>
-    <w:p>
-      <w:pPr>
-        <w:spacing w:line="240" w:lineRule="auto"/>
-        <w:jc w:val="center"/>
-        <w:rPr>
-          <w:rFonts w:ascii="Arial" w:eastAsia="Times New Roman" w:hAnsi="Arial" w:cs="Arial"/>
-          <w:i/>
-          <w:iCs/>
-          <w:sz w:val="20"/>
-          <w:szCs w:val="20"/>
-          <w:lang w:eastAsia="en-US"/>
-        </w:rPr>
-      </w:pPr>
-      <w:r>
-        <w:rPr>
-          <w:rFonts w:ascii="Arial" w:eastAsia="Times New Roman" w:hAnsi="Arial" w:cs="Arial"/>
-          <w:i/>
-          <w:iCs/>
-          <w:noProof/>
-          <w:sz w:val="20"/>
-          <w:szCs w:val="20"/>
-          <w:lang w:eastAsia="en-US"/>
-          <w14:ligatures w14:val="standardContextual"/>
-        </w:rPr>
-        <w:drawing>
-          <wp:inline distT="0" distB="0" distL="0" distR="0" wp14:anchorId="6B41DD38" wp14:editId="557F898F">
-            <wp:extent cx="2686050" cy="5353050"/>
-            <wp:effectExtent l="0" t="0" r="0" b="0"/>
-            <wp:docPr id="1973179013" name="Picture 1"/>
-            <wp:cNvGraphicFramePr>
-              <a:graphicFrameLocks xmlns:a="http://schemas.openxmlformats.org/drawingml/2006/main" noChangeAspect="1"/>
-            </wp:cNvGraphicFramePr>
-            <a:graphic xmlns:a="http://schemas.openxmlformats.org/drawingml/2006/main">
-              <a:graphicData uri="http://schemas.openxmlformats.org/drawingml/2006/picture">
-                <pic:pic xmlns:pic="http://schemas.openxmlformats.org/drawingml/2006/picture">
-                  <pic:nvPicPr>
-                    <pic:cNvPr id="1973179013" name="Picture 1973179013"/>
-                    <pic:cNvPicPr/>
-                  </pic:nvPicPr>
-                  <pic:blipFill>
-                    <a:blip r:embed="rId6">
-                      <a:extLst>
-                        <a:ext uri="{28A0092B-C50C-407E-A947-70E740481C1C}">
-                          <a14:useLocalDpi xmlns:a14="http://schemas.microsoft.com/office/drawing/2010/main" val="0"/>
-                        </a:ext>
-                      </a:extLst>
-                    </a:blip>
-                    <a:stretch>
-                      <a:fillRect/>
-                    </a:stretch>
-                  </pic:blipFill>
-                  <pic:spPr>
-                    <a:xfrm>
-                      <a:off x="0" y="0"/>
-                      <a:ext cx="2686050" cy="5353050"/>
-                    </a:xfrm>
-                    <a:prstGeom prst="rect">
-                      <a:avLst/>
-                    </a:prstGeom>
-                  </pic:spPr>
-                </pic:pic>
-              </a:graphicData>
-            </a:graphic>
-          </wp:inline>
-        </w:drawing>
-      </w:r>
-    </w:p>
-    <w:p>
-      <w:pPr>
-        <w:spacing w:line="240" w:lineRule="auto"/>
-        <w:jc w:val="center"/>
-        <w:rPr>
-          <w:rFonts w:ascii="Arial" w:eastAsia="Times New Roman" w:hAnsi="Arial" w:cs="Arial"/>
-          <w:i/>
-          <w:iCs/>
-          <w:sz w:val="20"/>
-          <w:szCs w:val="20"/>
-          <w:lang w:eastAsia="en-US"/>
-        </w:rPr>
-      </w:pPr>
-    </w:p>
     <w:p>
       <w:pPr>
         <w:rPr>
@@ -432,16 +217,7 @@
                 <w:sz w:val="22"/>
                 <w:lang w:eastAsia="en-US"/>
               </w:rPr>
-              <w:t xml:space="preserve">Displays a summarized profile; provides analytics such as profile views, profile completion, matching jobs, post impressions; </w:t>
-            </w:r>
-            <w:r>
-              <w:rPr>
-                <w:rFonts w:ascii="Arial" w:eastAsia="Times New Roman" w:hAnsi="Arial" w:cs="Arial"/>
-                <w:sz w:val="22"/>
-                <w:lang w:eastAsia="en-US"/>
-              </w:rPr>
-              <w:lastRenderedPageBreak/>
-              <w:t xml:space="preserve">recommends actions to take </w:t>
+              <w:t xml:space="preserve">Displays a summarized profile; provides analytics such as profile views, profile completion, matching jobs, post impressions; recommends actions to take </w:t>
             </w:r>
             <w:r>
               <w:rPr>
@@ -530,7 +306,6 @@
                 <w:sz w:val="22"/>
                 <w:lang w:eastAsia="en-US"/>
               </w:rPr>
-              <w:lastRenderedPageBreak/>
               <w:t>Requirements</w:t>
             </w:r>
           </w:p>
@@ -693,15 +468,7 @@
                 <w:sz w:val="22"/>
                 <w:lang w:eastAsia="en-US"/>
               </w:rPr>
-              <w:t>Click</w:t>
-            </w:r>
-            <w:r>
-              <w:rPr>
-                <w:rFonts w:ascii="Arial" w:eastAsia="Times New Roman" w:hAnsi="Arial" w:cs="Arial"/>
-                <w:sz w:val="22"/>
-                <w:lang w:eastAsia="en-US"/>
-              </w:rPr>
-              <w:t>, Scroll, Student News Story</w:t>
+              <w:t>Student Post</w:t>
             </w:r>
           </w:p>
         </w:tc>
@@ -752,47 +519,7 @@
                 <w:sz w:val="22"/>
                 <w:lang w:eastAsia="en-US"/>
               </w:rPr>
-              <w:t xml:space="preserve">Redirect to Profile Page, Redirect to Newsfeed Page, </w:t>
-            </w:r>
-            <w:r>
-              <w:rPr>
-                <w:rFonts w:ascii="Arial" w:eastAsia="Times New Roman" w:hAnsi="Arial" w:cs="Arial"/>
-                <w:sz w:val="22"/>
-                <w:lang w:eastAsia="en-US"/>
-              </w:rPr>
-              <w:t xml:space="preserve">Redirect to Resume Page, </w:t>
-            </w:r>
-            <w:r>
-              <w:rPr>
-                <w:rFonts w:ascii="Arial" w:eastAsia="Times New Roman" w:hAnsi="Arial" w:cs="Arial"/>
-                <w:sz w:val="22"/>
-                <w:lang w:eastAsia="en-US"/>
-              </w:rPr>
-              <w:t xml:space="preserve">Load </w:t>
-            </w:r>
-            <w:r>
-              <w:rPr>
-                <w:rFonts w:ascii="Arial" w:eastAsia="Times New Roman" w:hAnsi="Arial" w:cs="Arial"/>
-                <w:sz w:val="22"/>
-                <w:lang w:eastAsia="en-US"/>
-              </w:rPr>
-              <w:t xml:space="preserve">or update </w:t>
-            </w:r>
-            <w:r>
-              <w:rPr>
-                <w:rFonts w:ascii="Arial" w:eastAsia="Times New Roman" w:hAnsi="Arial" w:cs="Arial"/>
-                <w:sz w:val="22"/>
-                <w:lang w:eastAsia="en-US"/>
-              </w:rPr>
-              <w:t>newsfeed summary cards</w:t>
-            </w:r>
-            <w:r>
-              <w:rPr>
-                <w:rFonts w:ascii="Arial" w:eastAsia="Times New Roman" w:hAnsi="Arial" w:cs="Arial"/>
-                <w:sz w:val="22"/>
-                <w:lang w:eastAsia="en-US"/>
-              </w:rPr>
-              <w:t>, Toggle Notifications, Toggle Menu</w:t>
+              <w:t>New Student Post</w:t>
             </w:r>
           </w:p>
         </w:tc>

</xml_diff>

<commit_message>
Team 6 - ST - updated mobile mockup student dashboard to black and white and replaced image in docx with v03 drawing
</commit_message>
<xml_diff>
--- a/03_Team_Work/Team6/Milestone_2_First_Dozen_Views/IC_Done/ST_M2_Team6_StudentDashboardDesignInformationTable_v01.docx
+++ b/03_Team_Work/Team6/Milestone_2_First_Dozen_Views/IC_Done/ST_M2_Team6_StudentDashboardDesignInformationTable_v01.docx
@@ -6,10 +6,8 @@
       <w:pPr>
         <w:rPr>
           <w:rFonts w:ascii="Arial" w:eastAsia="Times New Roman" w:hAnsi="Arial" w:cs="Arial"/>
-          <w:i/>
-          <w:iCs/>
-          <w:sz w:val="20"/>
-          <w:szCs w:val="20"/>
+          <w:b/>
+          <w:bCs/>
           <w:lang w:eastAsia="en-US"/>
         </w:rPr>
       </w:pPr>
@@ -217,71 +215,7 @@
                 <w:sz w:val="22"/>
                 <w:lang w:eastAsia="en-US"/>
               </w:rPr>
-              <w:t xml:space="preserve">Displays a summarized profile; provides analytics such as profile views, profile completion, matching jobs, post impressions; recommends actions to take </w:t>
-            </w:r>
-            <w:r>
-              <w:rPr>
-                <w:rFonts w:ascii="Arial" w:eastAsia="Times New Roman" w:hAnsi="Arial" w:cs="Arial"/>
-                <w:sz w:val="22"/>
-                <w:lang w:eastAsia="en-US"/>
-              </w:rPr>
-              <w:t>such as</w:t>
-            </w:r>
-            <w:r>
-              <w:rPr>
-                <w:rFonts w:ascii="Arial" w:eastAsia="Times New Roman" w:hAnsi="Arial" w:cs="Arial"/>
-                <w:sz w:val="22"/>
-                <w:lang w:eastAsia="en-US"/>
-              </w:rPr>
-              <w:t xml:space="preserve"> improve profile</w:t>
-            </w:r>
-            <w:r>
-              <w:rPr>
-                <w:rFonts w:ascii="Arial" w:eastAsia="Times New Roman" w:hAnsi="Arial" w:cs="Arial"/>
-                <w:sz w:val="22"/>
-                <w:lang w:eastAsia="en-US"/>
-              </w:rPr>
-              <w:t>, create resume, apply for a job</w:t>
-            </w:r>
-            <w:r>
-              <w:rPr>
-                <w:rFonts w:ascii="Arial" w:eastAsia="Times New Roman" w:hAnsi="Arial" w:cs="Arial"/>
-                <w:sz w:val="22"/>
-                <w:lang w:eastAsia="en-US"/>
-              </w:rPr>
-              <w:t xml:space="preserve">; </w:t>
-            </w:r>
-            <w:r>
-              <w:rPr>
-                <w:rFonts w:ascii="Arial" w:eastAsia="Times New Roman" w:hAnsi="Arial" w:cs="Arial"/>
-                <w:sz w:val="22"/>
-                <w:lang w:eastAsia="en-US"/>
-              </w:rPr>
-              <w:t>provides a shortcut to post creation; and displays news</w:t>
-            </w:r>
-            <w:r>
-              <w:rPr>
-                <w:rFonts w:ascii="Arial" w:eastAsia="Times New Roman" w:hAnsi="Arial" w:cs="Arial"/>
-                <w:sz w:val="22"/>
-                <w:lang w:eastAsia="en-US"/>
-              </w:rPr>
-              <w:t xml:space="preserve"> </w:t>
-            </w:r>
-            <w:r>
-              <w:rPr>
-                <w:rFonts w:ascii="Arial" w:eastAsia="Times New Roman" w:hAnsi="Arial" w:cs="Arial"/>
-                <w:sz w:val="22"/>
-                <w:lang w:eastAsia="en-US"/>
-              </w:rPr>
-              <w:t>feed</w:t>
-            </w:r>
-            <w:r>
-              <w:rPr>
-                <w:rFonts w:ascii="Arial" w:eastAsia="Times New Roman" w:hAnsi="Arial" w:cs="Arial"/>
-                <w:sz w:val="22"/>
-                <w:lang w:eastAsia="en-US"/>
-              </w:rPr>
-              <w:t xml:space="preserve"> </w:t>
+              <w:t xml:space="preserve">Displays a summarized profile; provides analytics such as profile views, profile completion, matching jobs, post impressions; recommends actions to take such as improve profile, create resume, apply for a job; provides a shortcut to post creation; and displays news feed </w:t>
             </w:r>
           </w:p>
         </w:tc>
@@ -329,31 +263,638 @@
                 <w:sz w:val="22"/>
                 <w:lang w:eastAsia="en-US"/>
               </w:rPr>
-              <w:t>3.1</w:t>
-            </w:r>
-            <w:r>
-              <w:rPr>
-                <w:rFonts w:ascii="Arial" w:eastAsia="Times New Roman" w:hAnsi="Arial" w:cs="Arial"/>
-                <w:sz w:val="22"/>
-                <w:lang w:eastAsia="en-US"/>
-              </w:rPr>
-              <w:t xml:space="preserve"> Student User Profile, 3.2 Notifications, 3.4 News Feed</w:t>
-            </w:r>
-            <w:r>
-              <w:rPr>
-                <w:rFonts w:ascii="Arial" w:eastAsia="Times New Roman" w:hAnsi="Arial" w:cs="Arial"/>
-                <w:sz w:val="22"/>
-                <w:lang w:eastAsia="en-US"/>
-              </w:rPr>
-              <w:t>, 3.</w:t>
-            </w:r>
-            <w:r>
-              <w:rPr>
-                <w:rFonts w:ascii="Arial" w:eastAsia="Times New Roman" w:hAnsi="Arial" w:cs="Arial"/>
-                <w:sz w:val="22"/>
-                <w:lang w:eastAsia="en-US"/>
-              </w:rPr>
-              <w:t>5 Resume</w:t>
+              <w:t>3.1 Student User Profile, 3.2 Notifications, 3.4 News Feed, 3.5 Resume</w:t>
+            </w:r>
+          </w:p>
+        </w:tc>
+      </w:tr>
+      <w:tr>
+        <w:trPr>
+          <w:cnfStyle w:val="000000100000" w:firstRow="0" w:lastRow="0" w:firstColumn="0" w:lastColumn="0" w:oddVBand="0" w:evenVBand="0" w:oddHBand="1" w:evenHBand="0" w:firstRowFirstColumn="0" w:firstRowLastColumn="0" w:lastRowFirstColumn="0" w:lastRowLastColumn="0"/>
+          <w:trHeight w:val="146"/>
+        </w:trPr>
+        <w:tc>
+          <w:tcPr>
+            <w:cnfStyle w:val="001000000000" w:firstRow="0" w:lastRow="0" w:firstColumn="1" w:lastColumn="0" w:oddVBand="0" w:evenVBand="0" w:oddHBand="0" w:evenHBand="0" w:firstRowFirstColumn="0" w:firstRowLastColumn="0" w:lastRowFirstColumn="0" w:lastRowLastColumn="0"/>
+            <w:tcW w:w="4675" w:type="dxa"/>
+            <w:vMerge w:val="restart"/>
+          </w:tcPr>
+          <w:p>
+            <w:pPr>
+              <w:rPr>
+                <w:rFonts w:ascii="Arial" w:eastAsia="Times New Roman" w:hAnsi="Arial" w:cs="Arial"/>
+                <w:sz w:val="22"/>
+                <w:lang w:eastAsia="en-US"/>
+              </w:rPr>
+            </w:pPr>
+            <w:r>
+              <w:rPr>
+                <w:rFonts w:ascii="Arial" w:eastAsia="Times New Roman" w:hAnsi="Arial" w:cs="Arial"/>
+                <w:sz w:val="22"/>
+                <w:lang w:eastAsia="en-US"/>
+              </w:rPr>
+              <w:t>Elements</w:t>
+            </w:r>
+          </w:p>
+        </w:tc>
+        <w:tc>
+          <w:tcPr>
+            <w:tcW w:w="4675" w:type="dxa"/>
+          </w:tcPr>
+          <w:p>
+            <w:pPr>
+              <w:cnfStyle w:val="000000100000" w:firstRow="0" w:lastRow="0" w:firstColumn="0" w:lastColumn="0" w:oddVBand="0" w:evenVBand="0" w:oddHBand="1" w:evenHBand="0" w:firstRowFirstColumn="0" w:firstRowLastColumn="0" w:lastRowFirstColumn="0" w:lastRowLastColumn="0"/>
+              <w:rPr>
+                <w:rFonts w:ascii="Arial" w:eastAsia="Times New Roman" w:hAnsi="Arial" w:cs="Arial"/>
+                <w:sz w:val="22"/>
+                <w:lang w:eastAsia="en-US"/>
+              </w:rPr>
+            </w:pPr>
+            <w:r>
+              <w:rPr>
+                <w:rFonts w:ascii="Arial" w:eastAsia="Times New Roman" w:hAnsi="Arial" w:cs="Arial"/>
+                <w:sz w:val="22"/>
+                <w:lang w:eastAsia="en-US"/>
+              </w:rPr>
+              <w:t>Student Profile Summary Card</w:t>
+            </w:r>
+          </w:p>
+        </w:tc>
+      </w:tr>
+      <w:tr>
+        <w:trPr>
+          <w:trHeight w:val="146"/>
+        </w:trPr>
+        <w:tc>
+          <w:tcPr>
+            <w:cnfStyle w:val="001000000000" w:firstRow="0" w:lastRow="0" w:firstColumn="1" w:lastColumn="0" w:oddVBand="0" w:evenVBand="0" w:oddHBand="0" w:evenHBand="0" w:firstRowFirstColumn="0" w:firstRowLastColumn="0" w:lastRowFirstColumn="0" w:lastRowLastColumn="0"/>
+            <w:tcW w:w="4675" w:type="dxa"/>
+            <w:vMerge/>
+          </w:tcPr>
+          <w:p>
+            <w:pPr>
+              <w:rPr>
+                <w:rFonts w:ascii="Arial" w:eastAsia="Times New Roman" w:hAnsi="Arial" w:cs="Arial"/>
+                <w:sz w:val="22"/>
+                <w:lang w:eastAsia="en-US"/>
+              </w:rPr>
+            </w:pPr>
+          </w:p>
+        </w:tc>
+        <w:tc>
+          <w:tcPr>
+            <w:tcW w:w="4675" w:type="dxa"/>
+          </w:tcPr>
+          <w:p>
+            <w:pPr>
+              <w:cnfStyle w:val="000000000000" w:firstRow="0" w:lastRow="0" w:firstColumn="0" w:lastColumn="0" w:oddVBand="0" w:evenVBand="0" w:oddHBand="0" w:evenHBand="0" w:firstRowFirstColumn="0" w:firstRowLastColumn="0" w:lastRowFirstColumn="0" w:lastRowLastColumn="0"/>
+              <w:rPr>
+                <w:rFonts w:ascii="Arial" w:eastAsia="Times New Roman" w:hAnsi="Arial" w:cs="Arial"/>
+                <w:sz w:val="22"/>
+                <w:lang w:eastAsia="en-US"/>
+              </w:rPr>
+            </w:pPr>
+            <w:r>
+              <w:rPr>
+                <w:rFonts w:ascii="Arial" w:eastAsia="Times New Roman" w:hAnsi="Arial" w:cs="Arial"/>
+                <w:sz w:val="22"/>
+                <w:lang w:eastAsia="en-US"/>
+              </w:rPr>
+              <w:t>Student User Analytics Card</w:t>
+            </w:r>
+          </w:p>
+        </w:tc>
+      </w:tr>
+      <w:tr>
+        <w:trPr>
+          <w:cnfStyle w:val="000000100000" w:firstRow="0" w:lastRow="0" w:firstColumn="0" w:lastColumn="0" w:oddVBand="0" w:evenVBand="0" w:oddHBand="1" w:evenHBand="0" w:firstRowFirstColumn="0" w:firstRowLastColumn="0" w:lastRowFirstColumn="0" w:lastRowLastColumn="0"/>
+          <w:trHeight w:val="146"/>
+        </w:trPr>
+        <w:tc>
+          <w:tcPr>
+            <w:cnfStyle w:val="001000000000" w:firstRow="0" w:lastRow="0" w:firstColumn="1" w:lastColumn="0" w:oddVBand="0" w:evenVBand="0" w:oddHBand="0" w:evenHBand="0" w:firstRowFirstColumn="0" w:firstRowLastColumn="0" w:lastRowFirstColumn="0" w:lastRowLastColumn="0"/>
+            <w:tcW w:w="4675" w:type="dxa"/>
+            <w:vMerge/>
+          </w:tcPr>
+          <w:p>
+            <w:pPr>
+              <w:rPr>
+                <w:rFonts w:ascii="Arial" w:eastAsia="Times New Roman" w:hAnsi="Arial" w:cs="Arial"/>
+                <w:sz w:val="22"/>
+                <w:lang w:eastAsia="en-US"/>
+              </w:rPr>
+            </w:pPr>
+          </w:p>
+        </w:tc>
+        <w:tc>
+          <w:tcPr>
+            <w:tcW w:w="4675" w:type="dxa"/>
+          </w:tcPr>
+          <w:p>
+            <w:pPr>
+              <w:cnfStyle w:val="000000100000" w:firstRow="0" w:lastRow="0" w:firstColumn="0" w:lastColumn="0" w:oddVBand="0" w:evenVBand="0" w:oddHBand="1" w:evenHBand="0" w:firstRowFirstColumn="0" w:firstRowLastColumn="0" w:lastRowFirstColumn="0" w:lastRowLastColumn="0"/>
+              <w:rPr>
+                <w:rFonts w:ascii="Arial" w:eastAsia="Times New Roman" w:hAnsi="Arial" w:cs="Arial"/>
+                <w:sz w:val="22"/>
+                <w:lang w:eastAsia="en-US"/>
+              </w:rPr>
+            </w:pPr>
+            <w:r>
+              <w:rPr>
+                <w:rFonts w:ascii="Arial" w:eastAsia="Times New Roman" w:hAnsi="Arial" w:cs="Arial"/>
+                <w:sz w:val="22"/>
+                <w:lang w:eastAsia="en-US"/>
+              </w:rPr>
+              <w:t>Suggested Actions Card</w:t>
+            </w:r>
+          </w:p>
+        </w:tc>
+      </w:tr>
+      <w:tr>
+        <w:trPr>
+          <w:trHeight w:val="146"/>
+        </w:trPr>
+        <w:tc>
+          <w:tcPr>
+            <w:cnfStyle w:val="001000000000" w:firstRow="0" w:lastRow="0" w:firstColumn="1" w:lastColumn="0" w:oddVBand="0" w:evenVBand="0" w:oddHBand="0" w:evenHBand="0" w:firstRowFirstColumn="0" w:firstRowLastColumn="0" w:lastRowFirstColumn="0" w:lastRowLastColumn="0"/>
+            <w:tcW w:w="4675" w:type="dxa"/>
+            <w:vMerge/>
+          </w:tcPr>
+          <w:p>
+            <w:pPr>
+              <w:rPr>
+                <w:rFonts w:ascii="Arial" w:eastAsia="Times New Roman" w:hAnsi="Arial" w:cs="Arial"/>
+                <w:sz w:val="22"/>
+                <w:lang w:eastAsia="en-US"/>
+              </w:rPr>
+            </w:pPr>
+          </w:p>
+        </w:tc>
+        <w:tc>
+          <w:tcPr>
+            <w:tcW w:w="4675" w:type="dxa"/>
+          </w:tcPr>
+          <w:p>
+            <w:pPr>
+              <w:cnfStyle w:val="000000000000" w:firstRow="0" w:lastRow="0" w:firstColumn="0" w:lastColumn="0" w:oddVBand="0" w:evenVBand="0" w:oddHBand="0" w:evenHBand="0" w:firstRowFirstColumn="0" w:firstRowLastColumn="0" w:lastRowFirstColumn="0" w:lastRowLastColumn="0"/>
+              <w:rPr>
+                <w:rFonts w:ascii="Arial" w:eastAsia="Times New Roman" w:hAnsi="Arial" w:cs="Arial"/>
+                <w:sz w:val="22"/>
+                <w:lang w:eastAsia="en-US"/>
+              </w:rPr>
+            </w:pPr>
+            <w:r>
+              <w:rPr>
+                <w:rFonts w:ascii="Arial" w:eastAsia="Times New Roman" w:hAnsi="Arial" w:cs="Arial"/>
+                <w:sz w:val="22"/>
+                <w:lang w:eastAsia="en-US"/>
+              </w:rPr>
+              <w:t>Quick Create Post Card</w:t>
+            </w:r>
+          </w:p>
+        </w:tc>
+      </w:tr>
+      <w:tr>
+        <w:trPr>
+          <w:cnfStyle w:val="000000100000" w:firstRow="0" w:lastRow="0" w:firstColumn="0" w:lastColumn="0" w:oddVBand="0" w:evenVBand="0" w:oddHBand="1" w:evenHBand="0" w:firstRowFirstColumn="0" w:firstRowLastColumn="0" w:lastRowFirstColumn="0" w:lastRowLastColumn="0"/>
+          <w:trHeight w:val="146"/>
+        </w:trPr>
+        <w:tc>
+          <w:tcPr>
+            <w:cnfStyle w:val="001000000000" w:firstRow="0" w:lastRow="0" w:firstColumn="1" w:lastColumn="0" w:oddVBand="0" w:evenVBand="0" w:oddHBand="0" w:evenHBand="0" w:firstRowFirstColumn="0" w:firstRowLastColumn="0" w:lastRowFirstColumn="0" w:lastRowLastColumn="0"/>
+            <w:tcW w:w="4675" w:type="dxa"/>
+            <w:vMerge/>
+          </w:tcPr>
+          <w:p>
+            <w:pPr>
+              <w:rPr>
+                <w:rFonts w:ascii="Arial" w:eastAsia="Times New Roman" w:hAnsi="Arial" w:cs="Arial"/>
+                <w:sz w:val="22"/>
+                <w:lang w:eastAsia="en-US"/>
+              </w:rPr>
+            </w:pPr>
+          </w:p>
+        </w:tc>
+        <w:tc>
+          <w:tcPr>
+            <w:tcW w:w="4675" w:type="dxa"/>
+          </w:tcPr>
+          <w:p>
+            <w:pPr>
+              <w:cnfStyle w:val="000000100000" w:firstRow="0" w:lastRow="0" w:firstColumn="0" w:lastColumn="0" w:oddVBand="0" w:evenVBand="0" w:oddHBand="1" w:evenHBand="0" w:firstRowFirstColumn="0" w:firstRowLastColumn="0" w:lastRowFirstColumn="0" w:lastRowLastColumn="0"/>
+              <w:rPr>
+                <w:rFonts w:ascii="Arial" w:eastAsia="Times New Roman" w:hAnsi="Arial" w:cs="Arial"/>
+                <w:sz w:val="22"/>
+                <w:lang w:eastAsia="en-US"/>
+              </w:rPr>
+            </w:pPr>
+            <w:r>
+              <w:rPr>
+                <w:rFonts w:ascii="Arial" w:eastAsia="Times New Roman" w:hAnsi="Arial" w:cs="Arial"/>
+                <w:sz w:val="22"/>
+                <w:lang w:eastAsia="en-US"/>
+              </w:rPr>
+              <w:t>News feed List</w:t>
+            </w:r>
+          </w:p>
+        </w:tc>
+      </w:tr>
+      <w:tr>
+        <w:trPr>
+          <w:trHeight w:val="146"/>
+        </w:trPr>
+        <w:tc>
+          <w:tcPr>
+            <w:cnfStyle w:val="001000000000" w:firstRow="0" w:lastRow="0" w:firstColumn="1" w:lastColumn="0" w:oddVBand="0" w:evenVBand="0" w:oddHBand="0" w:evenHBand="0" w:firstRowFirstColumn="0" w:firstRowLastColumn="0" w:lastRowFirstColumn="0" w:lastRowLastColumn="0"/>
+            <w:tcW w:w="4675" w:type="dxa"/>
+            <w:vMerge/>
+          </w:tcPr>
+          <w:p>
+            <w:pPr>
+              <w:rPr>
+                <w:rFonts w:ascii="Arial" w:eastAsia="Times New Roman" w:hAnsi="Arial" w:cs="Arial"/>
+                <w:sz w:val="22"/>
+                <w:lang w:eastAsia="en-US"/>
+              </w:rPr>
+            </w:pPr>
+          </w:p>
+        </w:tc>
+        <w:tc>
+          <w:tcPr>
+            <w:tcW w:w="4675" w:type="dxa"/>
+          </w:tcPr>
+          <w:p>
+            <w:pPr>
+              <w:cnfStyle w:val="000000000000" w:firstRow="0" w:lastRow="0" w:firstColumn="0" w:lastColumn="0" w:oddVBand="0" w:evenVBand="0" w:oddHBand="0" w:evenHBand="0" w:firstRowFirstColumn="0" w:firstRowLastColumn="0" w:lastRowFirstColumn="0" w:lastRowLastColumn="0"/>
+              <w:rPr>
+                <w:rFonts w:ascii="Arial" w:eastAsia="Times New Roman" w:hAnsi="Arial" w:cs="Arial"/>
+                <w:sz w:val="22"/>
+                <w:lang w:eastAsia="en-US"/>
+              </w:rPr>
+            </w:pPr>
+            <w:r>
+              <w:rPr>
+                <w:rFonts w:ascii="Arial" w:eastAsia="Times New Roman" w:hAnsi="Arial" w:cs="Arial"/>
+                <w:sz w:val="22"/>
+                <w:lang w:eastAsia="en-US"/>
+              </w:rPr>
+              <w:t>News feed Card</w:t>
+            </w:r>
+          </w:p>
+        </w:tc>
+      </w:tr>
+      <w:tr>
+        <w:trPr>
+          <w:cnfStyle w:val="000000100000" w:firstRow="0" w:lastRow="0" w:firstColumn="0" w:lastColumn="0" w:oddVBand="0" w:evenVBand="0" w:oddHBand="1" w:evenHBand="0" w:firstRowFirstColumn="0" w:firstRowLastColumn="0" w:lastRowFirstColumn="0" w:lastRowLastColumn="0"/>
+          <w:trHeight w:val="146"/>
+        </w:trPr>
+        <w:tc>
+          <w:tcPr>
+            <w:cnfStyle w:val="001000000000" w:firstRow="0" w:lastRow="0" w:firstColumn="1" w:lastColumn="0" w:oddVBand="0" w:evenVBand="0" w:oddHBand="0" w:evenHBand="0" w:firstRowFirstColumn="0" w:firstRowLastColumn="0" w:lastRowFirstColumn="0" w:lastRowLastColumn="0"/>
+            <w:tcW w:w="4675" w:type="dxa"/>
+            <w:vMerge/>
+          </w:tcPr>
+          <w:p>
+            <w:pPr>
+              <w:rPr>
+                <w:rFonts w:ascii="Arial" w:eastAsia="Times New Roman" w:hAnsi="Arial" w:cs="Arial"/>
+                <w:sz w:val="22"/>
+                <w:lang w:eastAsia="en-US"/>
+              </w:rPr>
+            </w:pPr>
+          </w:p>
+        </w:tc>
+        <w:tc>
+          <w:tcPr>
+            <w:tcW w:w="4675" w:type="dxa"/>
+          </w:tcPr>
+          <w:p>
+            <w:pPr>
+              <w:cnfStyle w:val="000000100000" w:firstRow="0" w:lastRow="0" w:firstColumn="0" w:lastColumn="0" w:oddVBand="0" w:evenVBand="0" w:oddHBand="1" w:evenHBand="0" w:firstRowFirstColumn="0" w:firstRowLastColumn="0" w:lastRowFirstColumn="0" w:lastRowLastColumn="0"/>
+              <w:rPr>
+                <w:rFonts w:ascii="Arial" w:eastAsia="Times New Roman" w:hAnsi="Arial" w:cs="Arial"/>
+                <w:sz w:val="22"/>
+                <w:lang w:eastAsia="en-US"/>
+              </w:rPr>
+            </w:pPr>
+            <w:r>
+              <w:rPr>
+                <w:rFonts w:ascii="Arial" w:eastAsia="Times New Roman" w:hAnsi="Arial" w:cs="Arial"/>
+                <w:sz w:val="22"/>
+                <w:lang w:eastAsia="en-US"/>
+              </w:rPr>
+              <w:t>Submit Button</w:t>
+            </w:r>
+          </w:p>
+        </w:tc>
+      </w:tr>
+      <w:tr>
+        <w:trPr>
+          <w:trHeight w:val="146"/>
+        </w:trPr>
+        <w:tc>
+          <w:tcPr>
+            <w:cnfStyle w:val="001000000000" w:firstRow="0" w:lastRow="0" w:firstColumn="1" w:lastColumn="0" w:oddVBand="0" w:evenVBand="0" w:oddHBand="0" w:evenHBand="0" w:firstRowFirstColumn="0" w:firstRowLastColumn="0" w:lastRowFirstColumn="0" w:lastRowLastColumn="0"/>
+            <w:tcW w:w="4675" w:type="dxa"/>
+            <w:vMerge/>
+          </w:tcPr>
+          <w:p>
+            <w:pPr>
+              <w:rPr>
+                <w:rFonts w:ascii="Arial" w:eastAsia="Times New Roman" w:hAnsi="Arial" w:cs="Arial"/>
+                <w:sz w:val="22"/>
+                <w:lang w:eastAsia="en-US"/>
+              </w:rPr>
+            </w:pPr>
+          </w:p>
+        </w:tc>
+        <w:tc>
+          <w:tcPr>
+            <w:tcW w:w="4675" w:type="dxa"/>
+          </w:tcPr>
+          <w:p>
+            <w:pPr>
+              <w:cnfStyle w:val="000000000000" w:firstRow="0" w:lastRow="0" w:firstColumn="0" w:lastColumn="0" w:oddVBand="0" w:evenVBand="0" w:oddHBand="0" w:evenHBand="0" w:firstRowFirstColumn="0" w:firstRowLastColumn="0" w:lastRowFirstColumn="0" w:lastRowLastColumn="0"/>
+              <w:rPr>
+                <w:rFonts w:ascii="Arial" w:eastAsia="Times New Roman" w:hAnsi="Arial" w:cs="Arial"/>
+                <w:sz w:val="22"/>
+                <w:lang w:eastAsia="en-US"/>
+              </w:rPr>
+            </w:pPr>
+            <w:r>
+              <w:rPr>
+                <w:rFonts w:ascii="Arial" w:eastAsia="Times New Roman" w:hAnsi="Arial" w:cs="Arial"/>
+                <w:sz w:val="22"/>
+                <w:lang w:eastAsia="en-US"/>
+              </w:rPr>
+              <w:t>Navigation</w:t>
+            </w:r>
+          </w:p>
+        </w:tc>
+      </w:tr>
+      <w:tr>
+        <w:trPr>
+          <w:cnfStyle w:val="000000100000" w:firstRow="0" w:lastRow="0" w:firstColumn="0" w:lastColumn="0" w:oddVBand="0" w:evenVBand="0" w:oddHBand="1" w:evenHBand="0" w:firstRowFirstColumn="0" w:firstRowLastColumn="0" w:lastRowFirstColumn="0" w:lastRowLastColumn="0"/>
+          <w:trHeight w:val="146"/>
+        </w:trPr>
+        <w:tc>
+          <w:tcPr>
+            <w:cnfStyle w:val="001000000000" w:firstRow="0" w:lastRow="0" w:firstColumn="1" w:lastColumn="0" w:oddVBand="0" w:evenVBand="0" w:oddHBand="0" w:evenHBand="0" w:firstRowFirstColumn="0" w:firstRowLastColumn="0" w:lastRowFirstColumn="0" w:lastRowLastColumn="0"/>
+            <w:tcW w:w="4675" w:type="dxa"/>
+            <w:vMerge/>
+          </w:tcPr>
+          <w:p>
+            <w:pPr>
+              <w:rPr>
+                <w:rFonts w:ascii="Arial" w:eastAsia="Times New Roman" w:hAnsi="Arial" w:cs="Arial"/>
+                <w:sz w:val="22"/>
+                <w:lang w:eastAsia="en-US"/>
+              </w:rPr>
+            </w:pPr>
+          </w:p>
+        </w:tc>
+        <w:tc>
+          <w:tcPr>
+            <w:tcW w:w="4675" w:type="dxa"/>
+          </w:tcPr>
+          <w:p>
+            <w:pPr>
+              <w:cnfStyle w:val="000000100000" w:firstRow="0" w:lastRow="0" w:firstColumn="0" w:lastColumn="0" w:oddVBand="0" w:evenVBand="0" w:oddHBand="1" w:evenHBand="0" w:firstRowFirstColumn="0" w:firstRowLastColumn="0" w:lastRowFirstColumn="0" w:lastRowLastColumn="0"/>
+              <w:rPr>
+                <w:rFonts w:ascii="Arial" w:eastAsia="Times New Roman" w:hAnsi="Arial" w:cs="Arial"/>
+                <w:sz w:val="22"/>
+                <w:lang w:eastAsia="en-US"/>
+              </w:rPr>
+            </w:pPr>
+            <w:r>
+              <w:rPr>
+                <w:rFonts w:ascii="Arial" w:eastAsia="Times New Roman" w:hAnsi="Arial" w:cs="Arial"/>
+                <w:sz w:val="22"/>
+                <w:lang w:eastAsia="en-US"/>
+              </w:rPr>
+              <w:t>Header</w:t>
+            </w:r>
+          </w:p>
+        </w:tc>
+      </w:tr>
+      <w:tr>
+        <w:trPr>
+          <w:trHeight w:val="146"/>
+        </w:trPr>
+        <w:tc>
+          <w:tcPr>
+            <w:cnfStyle w:val="001000000000" w:firstRow="0" w:lastRow="0" w:firstColumn="1" w:lastColumn="0" w:oddVBand="0" w:evenVBand="0" w:oddHBand="0" w:evenHBand="0" w:firstRowFirstColumn="0" w:firstRowLastColumn="0" w:lastRowFirstColumn="0" w:lastRowLastColumn="0"/>
+            <w:tcW w:w="4675" w:type="dxa"/>
+            <w:vMerge/>
+          </w:tcPr>
+          <w:p>
+            <w:pPr>
+              <w:rPr>
+                <w:rFonts w:ascii="Arial" w:eastAsia="Times New Roman" w:hAnsi="Arial" w:cs="Arial"/>
+                <w:sz w:val="22"/>
+                <w:lang w:eastAsia="en-US"/>
+              </w:rPr>
+            </w:pPr>
+          </w:p>
+        </w:tc>
+        <w:tc>
+          <w:tcPr>
+            <w:tcW w:w="4675" w:type="dxa"/>
+          </w:tcPr>
+          <w:p>
+            <w:pPr>
+              <w:cnfStyle w:val="000000000000" w:firstRow="0" w:lastRow="0" w:firstColumn="0" w:lastColumn="0" w:oddVBand="0" w:evenVBand="0" w:oddHBand="0" w:evenHBand="0" w:firstRowFirstColumn="0" w:firstRowLastColumn="0" w:lastRowFirstColumn="0" w:lastRowLastColumn="0"/>
+              <w:rPr>
+                <w:rFonts w:ascii="Arial" w:eastAsia="Times New Roman" w:hAnsi="Arial" w:cs="Arial"/>
+                <w:sz w:val="22"/>
+                <w:lang w:eastAsia="en-US"/>
+              </w:rPr>
+            </w:pPr>
+            <w:r>
+              <w:rPr>
+                <w:rFonts w:ascii="Arial" w:eastAsia="Times New Roman" w:hAnsi="Arial" w:cs="Arial"/>
+                <w:sz w:val="22"/>
+                <w:lang w:eastAsia="en-US"/>
+              </w:rPr>
+              <w:t>Search bar</w:t>
+            </w:r>
+          </w:p>
+        </w:tc>
+      </w:tr>
+      <w:tr>
+        <w:trPr>
+          <w:cnfStyle w:val="000000100000" w:firstRow="0" w:lastRow="0" w:firstColumn="0" w:lastColumn="0" w:oddVBand="0" w:evenVBand="0" w:oddHBand="1" w:evenHBand="0" w:firstRowFirstColumn="0" w:firstRowLastColumn="0" w:lastRowFirstColumn="0" w:lastRowLastColumn="0"/>
+          <w:trHeight w:val="146"/>
+        </w:trPr>
+        <w:tc>
+          <w:tcPr>
+            <w:cnfStyle w:val="001000000000" w:firstRow="0" w:lastRow="0" w:firstColumn="1" w:lastColumn="0" w:oddVBand="0" w:evenVBand="0" w:oddHBand="0" w:evenHBand="0" w:firstRowFirstColumn="0" w:firstRowLastColumn="0" w:lastRowFirstColumn="0" w:lastRowLastColumn="0"/>
+            <w:tcW w:w="4675" w:type="dxa"/>
+            <w:vMerge/>
+          </w:tcPr>
+          <w:p>
+            <w:pPr>
+              <w:rPr>
+                <w:rFonts w:ascii="Arial" w:eastAsia="Times New Roman" w:hAnsi="Arial" w:cs="Arial"/>
+                <w:sz w:val="22"/>
+                <w:lang w:eastAsia="en-US"/>
+              </w:rPr>
+            </w:pPr>
+          </w:p>
+        </w:tc>
+        <w:tc>
+          <w:tcPr>
+            <w:tcW w:w="4675" w:type="dxa"/>
+          </w:tcPr>
+          <w:p>
+            <w:pPr>
+              <w:cnfStyle w:val="000000100000" w:firstRow="0" w:lastRow="0" w:firstColumn="0" w:lastColumn="0" w:oddVBand="0" w:evenVBand="0" w:oddHBand="1" w:evenHBand="0" w:firstRowFirstColumn="0" w:firstRowLastColumn="0" w:lastRowFirstColumn="0" w:lastRowLastColumn="0"/>
+              <w:rPr>
+                <w:rFonts w:ascii="Arial" w:eastAsia="Times New Roman" w:hAnsi="Arial" w:cs="Arial"/>
+                <w:sz w:val="22"/>
+                <w:lang w:eastAsia="en-US"/>
+              </w:rPr>
+            </w:pPr>
+            <w:r>
+              <w:rPr>
+                <w:rFonts w:ascii="Arial" w:eastAsia="Times New Roman" w:hAnsi="Arial" w:cs="Arial"/>
+                <w:sz w:val="22"/>
+                <w:lang w:eastAsia="en-US"/>
+              </w:rPr>
+              <w:t>Search button</w:t>
+            </w:r>
+          </w:p>
+        </w:tc>
+      </w:tr>
+      <w:tr>
+        <w:trPr>
+          <w:trHeight w:val="146"/>
+        </w:trPr>
+        <w:tc>
+          <w:tcPr>
+            <w:cnfStyle w:val="001000000000" w:firstRow="0" w:lastRow="0" w:firstColumn="1" w:lastColumn="0" w:oddVBand="0" w:evenVBand="0" w:oddHBand="0" w:evenHBand="0" w:firstRowFirstColumn="0" w:firstRowLastColumn="0" w:lastRowFirstColumn="0" w:lastRowLastColumn="0"/>
+            <w:tcW w:w="4675" w:type="dxa"/>
+            <w:vMerge/>
+          </w:tcPr>
+          <w:p>
+            <w:pPr>
+              <w:rPr>
+                <w:rFonts w:ascii="Arial" w:eastAsia="Times New Roman" w:hAnsi="Arial" w:cs="Arial"/>
+                <w:sz w:val="22"/>
+                <w:lang w:eastAsia="en-US"/>
+              </w:rPr>
+            </w:pPr>
+          </w:p>
+        </w:tc>
+        <w:tc>
+          <w:tcPr>
+            <w:tcW w:w="4675" w:type="dxa"/>
+          </w:tcPr>
+          <w:p>
+            <w:pPr>
+              <w:cnfStyle w:val="000000000000" w:firstRow="0" w:lastRow="0" w:firstColumn="0" w:lastColumn="0" w:oddVBand="0" w:evenVBand="0" w:oddHBand="0" w:evenHBand="0" w:firstRowFirstColumn="0" w:firstRowLastColumn="0" w:lastRowFirstColumn="0" w:lastRowLastColumn="0"/>
+              <w:rPr>
+                <w:rFonts w:ascii="Arial" w:eastAsia="Times New Roman" w:hAnsi="Arial" w:cs="Arial"/>
+                <w:sz w:val="22"/>
+                <w:lang w:eastAsia="en-US"/>
+              </w:rPr>
+            </w:pPr>
+            <w:r>
+              <w:rPr>
+                <w:rFonts w:ascii="Arial" w:eastAsia="Times New Roman" w:hAnsi="Arial" w:cs="Arial"/>
+                <w:sz w:val="22"/>
+                <w:lang w:eastAsia="en-US"/>
+              </w:rPr>
+              <w:t>Notifications toggle button</w:t>
+            </w:r>
+          </w:p>
+        </w:tc>
+      </w:tr>
+      <w:tr>
+        <w:trPr>
+          <w:cnfStyle w:val="000000100000" w:firstRow="0" w:lastRow="0" w:firstColumn="0" w:lastColumn="0" w:oddVBand="0" w:evenVBand="0" w:oddHBand="1" w:evenHBand="0" w:firstRowFirstColumn="0" w:firstRowLastColumn="0" w:lastRowFirstColumn="0" w:lastRowLastColumn="0"/>
+          <w:trHeight w:val="146"/>
+        </w:trPr>
+        <w:tc>
+          <w:tcPr>
+            <w:cnfStyle w:val="001000000000" w:firstRow="0" w:lastRow="0" w:firstColumn="1" w:lastColumn="0" w:oddVBand="0" w:evenVBand="0" w:oddHBand="0" w:evenHBand="0" w:firstRowFirstColumn="0" w:firstRowLastColumn="0" w:lastRowFirstColumn="0" w:lastRowLastColumn="0"/>
+            <w:tcW w:w="4675" w:type="dxa"/>
+            <w:vMerge/>
+          </w:tcPr>
+          <w:p>
+            <w:pPr>
+              <w:rPr>
+                <w:rFonts w:ascii="Arial" w:eastAsia="Times New Roman" w:hAnsi="Arial" w:cs="Arial"/>
+                <w:sz w:val="22"/>
+                <w:lang w:eastAsia="en-US"/>
+              </w:rPr>
+            </w:pPr>
+          </w:p>
+        </w:tc>
+        <w:tc>
+          <w:tcPr>
+            <w:tcW w:w="4675" w:type="dxa"/>
+          </w:tcPr>
+          <w:p>
+            <w:pPr>
+              <w:cnfStyle w:val="000000100000" w:firstRow="0" w:lastRow="0" w:firstColumn="0" w:lastColumn="0" w:oddVBand="0" w:evenVBand="0" w:oddHBand="1" w:evenHBand="0" w:firstRowFirstColumn="0" w:firstRowLastColumn="0" w:lastRowFirstColumn="0" w:lastRowLastColumn="0"/>
+              <w:rPr>
+                <w:rFonts w:ascii="Arial" w:eastAsia="Times New Roman" w:hAnsi="Arial" w:cs="Arial"/>
+                <w:sz w:val="22"/>
+                <w:lang w:eastAsia="en-US"/>
+              </w:rPr>
+            </w:pPr>
+            <w:r>
+              <w:rPr>
+                <w:rFonts w:ascii="Arial" w:eastAsia="Times New Roman" w:hAnsi="Arial" w:cs="Arial"/>
+                <w:sz w:val="22"/>
+                <w:lang w:eastAsia="en-US"/>
+              </w:rPr>
+              <w:t>Profile Page hyperlink button</w:t>
+            </w:r>
+          </w:p>
+        </w:tc>
+      </w:tr>
+      <w:tr>
+        <w:trPr>
+          <w:trHeight w:val="146"/>
+        </w:trPr>
+        <w:tc>
+          <w:tcPr>
+            <w:cnfStyle w:val="001000000000" w:firstRow="0" w:lastRow="0" w:firstColumn="1" w:lastColumn="0" w:oddVBand="0" w:evenVBand="0" w:oddHBand="0" w:evenHBand="0" w:firstRowFirstColumn="0" w:firstRowLastColumn="0" w:lastRowFirstColumn="0" w:lastRowLastColumn="0"/>
+            <w:tcW w:w="4675" w:type="dxa"/>
+            <w:vMerge/>
+          </w:tcPr>
+          <w:p>
+            <w:pPr>
+              <w:rPr>
+                <w:rFonts w:ascii="Arial" w:eastAsia="Times New Roman" w:hAnsi="Arial" w:cs="Arial"/>
+                <w:sz w:val="22"/>
+                <w:lang w:eastAsia="en-US"/>
+              </w:rPr>
+            </w:pPr>
+          </w:p>
+        </w:tc>
+        <w:tc>
+          <w:tcPr>
+            <w:tcW w:w="4675" w:type="dxa"/>
+          </w:tcPr>
+          <w:p>
+            <w:pPr>
+              <w:cnfStyle w:val="000000000000" w:firstRow="0" w:lastRow="0" w:firstColumn="0" w:lastColumn="0" w:oddVBand="0" w:evenVBand="0" w:oddHBand="0" w:evenHBand="0" w:firstRowFirstColumn="0" w:firstRowLastColumn="0" w:lastRowFirstColumn="0" w:lastRowLastColumn="0"/>
+              <w:rPr>
+                <w:rFonts w:ascii="Arial" w:eastAsia="Times New Roman" w:hAnsi="Arial" w:cs="Arial"/>
+                <w:sz w:val="22"/>
+                <w:lang w:eastAsia="en-US"/>
+              </w:rPr>
+            </w:pPr>
+            <w:r>
+              <w:rPr>
+                <w:rFonts w:ascii="Arial" w:eastAsia="Times New Roman" w:hAnsi="Arial" w:cs="Arial"/>
+                <w:sz w:val="22"/>
+                <w:lang w:eastAsia="en-US"/>
+              </w:rPr>
+              <w:t>Pagination</w:t>
             </w:r>
           </w:p>
         </w:tc>
@@ -381,7 +922,7 @@
                 <w:sz w:val="22"/>
                 <w:lang w:eastAsia="en-US"/>
               </w:rPr>
-              <w:t>Elements</w:t>
+              <w:t>Inputs</w:t>
             </w:r>
           </w:p>
         </w:tc>
@@ -404,23 +945,15 @@
                 <w:sz w:val="22"/>
                 <w:lang w:eastAsia="en-US"/>
               </w:rPr>
-              <w:t xml:space="preserve">Student Profile Summary, Student User Analytics, Suggested Actions, </w:t>
-            </w:r>
-            <w:r>
-              <w:rPr>
-                <w:rFonts w:ascii="Arial" w:eastAsia="Times New Roman" w:hAnsi="Arial" w:cs="Arial"/>
-                <w:sz w:val="22"/>
-                <w:lang w:eastAsia="en-US"/>
-              </w:rPr>
-              <w:t xml:space="preserve">Quick </w:t>
-            </w:r>
-            <w:r>
-              <w:rPr>
-                <w:rFonts w:ascii="Arial" w:eastAsia="Times New Roman" w:hAnsi="Arial" w:cs="Arial"/>
-                <w:sz w:val="22"/>
-                <w:lang w:eastAsia="en-US"/>
-              </w:rPr>
-              <w:t>Create Post, Newsfeed</w:t>
+              <w:t>Student Post</w:t>
+            </w:r>
+            <w:r>
+              <w:rPr>
+                <w:rFonts w:ascii="Arial" w:eastAsia="Times New Roman" w:hAnsi="Arial" w:cs="Arial"/>
+                <w:sz w:val="22"/>
+                <w:lang w:eastAsia="en-US"/>
+              </w:rPr>
+              <w:t>, Click, Scroll</w:t>
             </w:r>
           </w:p>
         </w:tc>
@@ -445,7 +978,7 @@
                 <w:sz w:val="22"/>
                 <w:lang w:eastAsia="en-US"/>
               </w:rPr>
-              <w:t>Inputs</w:t>
+              <w:t>Outputs</w:t>
             </w:r>
           </w:p>
         </w:tc>
@@ -468,7 +1001,15 @@
                 <w:sz w:val="22"/>
                 <w:lang w:eastAsia="en-US"/>
               </w:rPr>
-              <w:t>Student Post</w:t>
+              <w:t>New Student Post</w:t>
+            </w:r>
+            <w:r>
+              <w:rPr>
+                <w:rFonts w:ascii="Arial" w:eastAsia="Times New Roman" w:hAnsi="Arial" w:cs="Arial"/>
+                <w:sz w:val="22"/>
+                <w:lang w:eastAsia="en-US"/>
+              </w:rPr>
+              <w:t>, Redirect, Navigate to next action card</w:t>
             </w:r>
           </w:p>
         </w:tc>
@@ -496,7 +1037,7 @@
                 <w:sz w:val="22"/>
                 <w:lang w:eastAsia="en-US"/>
               </w:rPr>
-              <w:t>Outputs</w:t>
+              <w:t>Navigation / References</w:t>
             </w:r>
           </w:p>
         </w:tc>
@@ -519,7 +1060,7 @@
                 <w:sz w:val="22"/>
                 <w:lang w:eastAsia="en-US"/>
               </w:rPr>
-              <w:t>New Student Post</w:t>
+              <w:t>Login/Logout, Student Profile, Resume Builder, Job Search, Notifications, News Feed</w:t>
             </w:r>
           </w:p>
         </w:tc>
@@ -544,7 +1085,7 @@
                 <w:sz w:val="22"/>
                 <w:lang w:eastAsia="en-US"/>
               </w:rPr>
-              <w:t>Navigation / References</w:t>
+              <w:t>Viewpoint</w:t>
             </w:r>
           </w:p>
         </w:tc>
@@ -555,57 +1096,6 @@
           <w:p>
             <w:pPr>
               <w:cnfStyle w:val="000000000000" w:firstRow="0" w:lastRow="0" w:firstColumn="0" w:lastColumn="0" w:oddVBand="0" w:evenVBand="0" w:oddHBand="0" w:evenHBand="0" w:firstRowFirstColumn="0" w:firstRowLastColumn="0" w:lastRowFirstColumn="0" w:lastRowLastColumn="0"/>
-              <w:rPr>
-                <w:rFonts w:ascii="Arial" w:eastAsia="Times New Roman" w:hAnsi="Arial" w:cs="Arial"/>
-                <w:sz w:val="22"/>
-                <w:lang w:eastAsia="en-US"/>
-              </w:rPr>
-            </w:pPr>
-            <w:r>
-              <w:rPr>
-                <w:rFonts w:ascii="Arial" w:eastAsia="Times New Roman" w:hAnsi="Arial" w:cs="Arial"/>
-                <w:sz w:val="22"/>
-                <w:lang w:eastAsia="en-US"/>
-              </w:rPr>
-              <w:t>Login/Logout, Student Profile, Resume Builder, Job Search, Notifications, News Feed</w:t>
-            </w:r>
-          </w:p>
-        </w:tc>
-      </w:tr>
-      <w:tr>
-        <w:trPr>
-          <w:cnfStyle w:val="000000100000" w:firstRow="0" w:lastRow="0" w:firstColumn="0" w:lastColumn="0" w:oddVBand="0" w:evenVBand="0" w:oddHBand="1" w:evenHBand="0" w:firstRowFirstColumn="0" w:firstRowLastColumn="0" w:lastRowFirstColumn="0" w:lastRowLastColumn="0"/>
-        </w:trPr>
-        <w:tc>
-          <w:tcPr>
-            <w:cnfStyle w:val="001000000000" w:firstRow="0" w:lastRow="0" w:firstColumn="1" w:lastColumn="0" w:oddVBand="0" w:evenVBand="0" w:oddHBand="0" w:evenHBand="0" w:firstRowFirstColumn="0" w:firstRowLastColumn="0" w:lastRowFirstColumn="0" w:lastRowLastColumn="0"/>
-            <w:tcW w:w="4675" w:type="dxa"/>
-          </w:tcPr>
-          <w:p>
-            <w:pPr>
-              <w:rPr>
-                <w:rFonts w:ascii="Arial" w:eastAsia="Times New Roman" w:hAnsi="Arial" w:cs="Arial"/>
-                <w:sz w:val="22"/>
-                <w:lang w:eastAsia="en-US"/>
-              </w:rPr>
-            </w:pPr>
-            <w:r>
-              <w:rPr>
-                <w:rFonts w:ascii="Arial" w:eastAsia="Times New Roman" w:hAnsi="Arial" w:cs="Arial"/>
-                <w:sz w:val="22"/>
-                <w:lang w:eastAsia="en-US"/>
-              </w:rPr>
-              <w:t>Viewpoint</w:t>
-            </w:r>
-          </w:p>
-        </w:tc>
-        <w:tc>
-          <w:tcPr>
-            <w:tcW w:w="4675" w:type="dxa"/>
-          </w:tcPr>
-          <w:p>
-            <w:pPr>
-              <w:cnfStyle w:val="000000100000" w:firstRow="0" w:lastRow="0" w:firstColumn="0" w:lastColumn="0" w:oddVBand="0" w:evenVBand="0" w:oddHBand="1" w:evenHBand="0" w:firstRowFirstColumn="0" w:firstRowLastColumn="0" w:lastRowFirstColumn="0" w:lastRowLastColumn="0"/>
               <w:rPr>
                 <w:rFonts w:ascii="Arial" w:eastAsia="Times New Roman" w:hAnsi="Arial" w:cs="Arial"/>
                 <w:sz w:val="22"/>
@@ -624,7 +1114,30 @@
         </w:tc>
       </w:tr>
     </w:tbl>
-    <w:p/>
+    <w:p>
+      <w:pPr>
+        <w:rPr>
+          <w:rFonts w:ascii="Arial" w:eastAsia="Times New Roman" w:hAnsi="Arial" w:cs="Arial"/>
+          <w:i/>
+          <w:iCs/>
+          <w:sz w:val="20"/>
+          <w:szCs w:val="20"/>
+          <w:lang w:eastAsia="en-US"/>
+        </w:rPr>
+      </w:pPr>
+    </w:p>
+    <w:p>
+      <w:pPr>
+        <w:rPr>
+          <w:rFonts w:ascii="Arial" w:eastAsia="Times New Roman" w:hAnsi="Arial" w:cs="Arial"/>
+          <w:i/>
+          <w:iCs/>
+          <w:sz w:val="20"/>
+          <w:szCs w:val="20"/>
+          <w:lang w:eastAsia="en-US"/>
+        </w:rPr>
+      </w:pPr>
+    </w:p>
     <w:sectPr>
       <w:pgSz w:w="12240" w:h="15840"/>
       <w:pgMar w:top="1440" w:right="1440" w:bottom="1440" w:left="1440" w:header="708" w:footer="708" w:gutter="0"/>

</xml_diff>